<commit_message>
Atualiza o papel timbrado
</commit_message>
<xml_diff>
--- a/src/downloads/SEE CARPINA - Timbre Horizontal.docx
+++ b/src/downloads/SEE CARPINA - Timbre Horizontal.docx
@@ -2,7 +2,11 @@
 <file path=word/document.xml><?xml version="1.0" encoding="utf-8"?>
 <w:document xmlns:wpc="http://schemas.microsoft.com/office/word/2010/wordprocessingCanvas" xmlns:cx="http://schemas.microsoft.com/office/drawing/2014/chartex" xmlns:cx1="http://schemas.microsoft.com/office/drawing/2015/9/8/chartex" xmlns:cx2="http://schemas.microsoft.com/office/drawing/2015/10/21/chartex" xmlns:cx3="http://schemas.microsoft.com/office/drawing/2016/5/9/chartex" xmlns:cx4="http://schemas.microsoft.com/office/drawing/2016/5/10/chartex" xmlns:cx5="http://schemas.microsoft.com/office/drawing/2016/5/11/chartex" xmlns:cx6="http://schemas.microsoft.com/office/drawing/2016/5/12/chartex" xmlns:cx7="http://schemas.microsoft.com/office/drawing/2016/5/13/chartex" xmlns:cx8="http://schemas.microsoft.com/office/drawing/2016/5/14/chartex" xmlns:mc="http://schemas.openxmlformats.org/markup-compatibility/2006" xmlns:aink="http://schemas.microsoft.com/office/drawing/2016/ink" xmlns:am3d="http://schemas.microsoft.com/office/drawing/2017/model3d" xmlns:o="urn:schemas-microsoft-com:office:office" xmlns:oel="http://schemas.microsoft.com/office/2019/extlst" xmlns:r="http://schemas.openxmlformats.org/officeDocument/2006/relationships" xmlns:m="http://schemas.openxmlformats.org/officeDocument/2006/math" xmlns:v="urn:schemas-microsoft-com:vml" xmlns:wp14="http://schemas.microsoft.com/office/word/2010/wordprocessingDrawing" xmlns:wp="http://schemas.openxmlformats.org/drawingml/2006/wordprocessingDrawing" xmlns:w10="urn:schemas-microsoft-com:office:word" xmlns:w="http://schemas.openxmlformats.org/wordprocessingml/2006/main" xmlns:w14="http://schemas.microsoft.com/office/word/2010/wordml" xmlns:w15="http://schemas.microsoft.com/office/word/2012/wordml" xmlns:w16cex="http://schemas.microsoft.com/office/word/2018/wordml/cex" xmlns:w16cid="http://schemas.microsoft.com/office/word/2016/wordml/cid" xmlns:w16="http://schemas.microsoft.com/office/word/2018/wordml" xmlns:w16du="http://schemas.microsoft.com/office/word/2023/wordml/word16du" xmlns:w16sdtdh="http://schemas.microsoft.com/office/word/2020/wordml/sdtdatahash" xmlns:w16sdtfl="http://schemas.microsoft.com/office/word/2024/wordml/sdtformatlock" xmlns:w16se="http://schemas.microsoft.com/office/word/2015/wordml/symex" xmlns:wpg="http://schemas.microsoft.com/office/word/2010/wordprocessingGroup" xmlns:wpi="http://schemas.microsoft.com/office/word/2010/wordprocessingInk" xmlns:wne="http://schemas.microsoft.com/office/word/2006/wordml" xmlns:wps="http://schemas.microsoft.com/office/word/2010/wordprocessingShape" mc:Ignorable="w14 w15 w16se w16cid w16 w16cex w16sdtdh w16sdtfl w16du wp14">
   <w:body>
-    <w:p/>
+    <w:p>
+      <w:pPr>
+        <w:spacing w:line="360" w:lineRule="auto"/>
+      </w:pPr>
+    </w:p>
     <w:sectPr>
       <w:headerReference w:type="default" r:id="rId8"/>
       <w:footerReference w:type="default" r:id="rId9"/>
@@ -46,191 +50,6 @@
     </w:pPr>
     <w:r>
       <w:rPr>
-        <w:b/>
-        <w:noProof/>
-        <w:sz w:val="22"/>
-        <w:szCs w:val="24"/>
-      </w:rPr>
-      <mc:AlternateContent>
-        <mc:Choice Requires="wpg">
-          <w:drawing>
-            <wp:anchor distT="0" distB="0" distL="114300" distR="114300" simplePos="0" relativeHeight="251667456" behindDoc="1" locked="0" layoutInCell="1" allowOverlap="1" wp14:anchorId="1277774B" wp14:editId="48689749">
-              <wp:simplePos x="0" y="0"/>
-              <wp:positionH relativeFrom="column">
-                <wp:posOffset>-527050</wp:posOffset>
-              </wp:positionH>
-              <wp:positionV relativeFrom="paragraph">
-                <wp:posOffset>-170815</wp:posOffset>
-              </wp:positionV>
-              <wp:extent cx="10344501" cy="173164"/>
-              <wp:effectExtent l="0" t="0" r="0" b="0"/>
-              <wp:wrapNone/>
-              <wp:docPr id="813876506" name="Agrupar 7"/>
-              <wp:cNvGraphicFramePr/>
-              <a:graphic xmlns:a="http://schemas.openxmlformats.org/drawingml/2006/main">
-                <a:graphicData uri="http://schemas.microsoft.com/office/word/2010/wordprocessingGroup">
-                  <wpg:wgp>
-                    <wpg:cNvGrpSpPr/>
-                    <wpg:grpSpPr>
-                      <a:xfrm>
-                        <a:off x="0" y="0"/>
-                        <a:ext cx="10344501" cy="173164"/>
-                        <a:chOff x="0" y="0"/>
-                        <a:chExt cx="8745264" cy="154305"/>
-                      </a:xfrm>
-                    </wpg:grpSpPr>
-                    <pic:pic xmlns:pic="http://schemas.openxmlformats.org/drawingml/2006/picture">
-                      <pic:nvPicPr>
-                        <pic:cNvPr id="1965836306" name="Imagem 3"/>
-                        <pic:cNvPicPr>
-                          <a:picLocks noChangeAspect="1"/>
-                        </pic:cNvPicPr>
-                      </pic:nvPicPr>
-                      <pic:blipFill>
-                        <a:blip r:embed="rId1">
-                          <a:extLst>
-                            <a:ext uri="{28A0092B-C50C-407E-A947-70E740481C1C}">
-                              <a14:useLocalDpi xmlns:a14="http://schemas.microsoft.com/office/drawing/2010/main" val="0"/>
-                            </a:ext>
-                          </a:extLst>
-                        </a:blip>
-                        <a:srcRect/>
-                        <a:stretch>
-                          <a:fillRect/>
-                        </a:stretch>
-                      </pic:blipFill>
-                      <pic:spPr bwMode="auto">
-                        <a:xfrm>
-                          <a:off x="0" y="0"/>
-                          <a:ext cx="2929255" cy="154305"/>
-                        </a:xfrm>
-                        <a:prstGeom prst="rect">
-                          <a:avLst/>
-                        </a:prstGeom>
-                        <a:noFill/>
-                        <a:ln>
-                          <a:noFill/>
-                        </a:ln>
-                      </pic:spPr>
-                    </pic:pic>
-                    <pic:pic xmlns:pic="http://schemas.openxmlformats.org/drawingml/2006/picture">
-                      <pic:nvPicPr>
-                        <pic:cNvPr id="931070024" name="Imagem 3"/>
-                        <pic:cNvPicPr>
-                          <a:picLocks noChangeAspect="1"/>
-                        </pic:cNvPicPr>
-                      </pic:nvPicPr>
-                      <pic:blipFill>
-                        <a:blip r:embed="rId1">
-                          <a:extLst>
-                            <a:ext uri="{28A0092B-C50C-407E-A947-70E740481C1C}">
-                              <a14:useLocalDpi xmlns:a14="http://schemas.microsoft.com/office/drawing/2010/main" val="0"/>
-                            </a:ext>
-                          </a:extLst>
-                        </a:blip>
-                        <a:srcRect/>
-                        <a:stretch>
-                          <a:fillRect/>
-                        </a:stretch>
-                      </pic:blipFill>
-                      <pic:spPr bwMode="auto">
-                        <a:xfrm>
-                          <a:off x="2902688" y="0"/>
-                          <a:ext cx="2929255" cy="154305"/>
-                        </a:xfrm>
-                        <a:prstGeom prst="rect">
-                          <a:avLst/>
-                        </a:prstGeom>
-                        <a:noFill/>
-                        <a:ln>
-                          <a:noFill/>
-                        </a:ln>
-                      </pic:spPr>
-                    </pic:pic>
-                    <pic:pic xmlns:pic="http://schemas.openxmlformats.org/drawingml/2006/picture">
-                      <pic:nvPicPr>
-                        <pic:cNvPr id="1692521654" name="Imagem 3"/>
-                        <pic:cNvPicPr>
-                          <a:picLocks noChangeAspect="1"/>
-                        </pic:cNvPicPr>
-                      </pic:nvPicPr>
-                      <pic:blipFill>
-                        <a:blip r:embed="rId1">
-                          <a:extLst>
-                            <a:ext uri="{28A0092B-C50C-407E-A947-70E740481C1C}">
-                              <a14:useLocalDpi xmlns:a14="http://schemas.microsoft.com/office/drawing/2010/main" val="0"/>
-                            </a:ext>
-                          </a:extLst>
-                        </a:blip>
-                        <a:srcRect/>
-                        <a:stretch>
-                          <a:fillRect/>
-                        </a:stretch>
-                      </pic:blipFill>
-                      <pic:spPr bwMode="auto">
-                        <a:xfrm>
-                          <a:off x="5816009" y="0"/>
-                          <a:ext cx="2929255" cy="154305"/>
-                        </a:xfrm>
-                        <a:prstGeom prst="rect">
-                          <a:avLst/>
-                        </a:prstGeom>
-                        <a:noFill/>
-                        <a:ln>
-                          <a:noFill/>
-                        </a:ln>
-                      </pic:spPr>
-                    </pic:pic>
-                  </wpg:wgp>
-                </a:graphicData>
-              </a:graphic>
-              <wp14:sizeRelH relativeFrom="margin">
-                <wp14:pctWidth>0</wp14:pctWidth>
-              </wp14:sizeRelH>
-              <wp14:sizeRelV relativeFrom="margin">
-                <wp14:pctHeight>0</wp14:pctHeight>
-              </wp14:sizeRelV>
-            </wp:anchor>
-          </w:drawing>
-        </mc:Choice>
-        <mc:Fallback>
-          <w:pict>
-            <v:group w14:anchorId="02C17513" id="Agrupar 7" o:spid="_x0000_s1026" style="position:absolute;margin-left:-41.5pt;margin-top:-13.45pt;width:814.55pt;height:13.65pt;z-index:-251649024;mso-width-relative:margin;mso-height-relative:margin" coordsize="87452,1543" o:gfxdata="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">
-              <v:shapetype id="_x0000_t75" coordsize="21600,21600" o:spt="75" o:preferrelative="t" path="m@4@5l@4@11@9@11@9@5xe" filled="f" stroked="f">
-                <v:stroke joinstyle="miter"/>
-                <v:formulas>
-                  <v:f eqn="if lineDrawn pixelLineWidth 0"/>
-                  <v:f eqn="sum @0 1 0"/>
-                  <v:f eqn="sum 0 0 @1"/>
-                  <v:f eqn="prod @2 1 2"/>
-                  <v:f eqn="prod @3 21600 pixelWidth"/>
-                  <v:f eqn="prod @3 21600 pixelHeight"/>
-                  <v:f eqn="sum @0 0 1"/>
-                  <v:f eqn="prod @6 1 2"/>
-                  <v:f eqn="prod @7 21600 pixelWidth"/>
-                  <v:f eqn="sum @8 21600 0"/>
-                  <v:f eqn="prod @7 21600 pixelHeight"/>
-                  <v:f eqn="sum @10 21600 0"/>
-                </v:formulas>
-                <v:path o:extrusionok="f" gradientshapeok="t" o:connecttype="rect"/>
-                <o:lock v:ext="edit" aspectratio="t"/>
-              </v:shapetype>
-              <v:shape id="Imagem 3" o:spid="_x0000_s1027" type="#_x0000_t75" style="position:absolute;width:29292;height:1543;visibility:visible;mso-wrap-style:square" o:gfxdata="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">
-                <v:imagedata r:id="rId2" o:title=""/>
-              </v:shape>
-              <v:shape id="Imagem 3" o:spid="_x0000_s1028" type="#_x0000_t75" style="position:absolute;left:29026;width:29293;height:1543;visibility:visible;mso-wrap-style:square" o:gfxdata="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">
-                <v:imagedata r:id="rId2" o:title=""/>
-              </v:shape>
-              <v:shape id="Imagem 3" o:spid="_x0000_s1029" type="#_x0000_t75" style="position:absolute;left:58160;width:29292;height:1543;visibility:visible;mso-wrap-style:square" o:gfxdata="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">
-                <v:imagedata r:id="rId2" o:title=""/>
-              </v:shape>
-            </v:group>
-          </w:pict>
-        </mc:Fallback>
-      </mc:AlternateContent>
-    </w:r>
-    <w:r>
-      <w:rPr>
         <w:sz w:val="18"/>
         <w:szCs w:val="18"/>
       </w:rPr>
@@ -397,197 +216,22 @@
     <w:r>
       <w:rPr>
         <w:noProof/>
-      </w:rPr>
-      <mc:AlternateContent>
-        <mc:Choice Requires="wps">
-          <w:drawing>
-            <wp:anchor distT="0" distB="0" distL="114300" distR="114300" simplePos="0" relativeHeight="251671552" behindDoc="0" locked="0" layoutInCell="1" allowOverlap="1" wp14:anchorId="055424B0" wp14:editId="7C4FB2A4">
-              <wp:simplePos x="0" y="0"/>
-              <wp:positionH relativeFrom="column">
-                <wp:posOffset>2534285</wp:posOffset>
-              </wp:positionH>
-              <wp:positionV relativeFrom="paragraph">
-                <wp:posOffset>-147320</wp:posOffset>
-              </wp:positionV>
-              <wp:extent cx="6504940" cy="590550"/>
-              <wp:effectExtent l="0" t="0" r="0" b="0"/>
-              <wp:wrapNone/>
-              <wp:docPr id="932104395" name="Caixa de Texto 7"/>
-              <wp:cNvGraphicFramePr/>
-              <a:graphic xmlns:a="http://schemas.openxmlformats.org/drawingml/2006/main">
-                <a:graphicData uri="http://schemas.microsoft.com/office/word/2010/wordprocessingShape">
-                  <wps:wsp>
-                    <wps:cNvSpPr txBox="1"/>
-                    <wps:spPr>
-                      <a:xfrm>
-                        <a:off x="0" y="0"/>
-                        <a:ext cx="6504940" cy="590550"/>
-                      </a:xfrm>
-                      <a:prstGeom prst="rect">
-                        <a:avLst/>
-                      </a:prstGeom>
-                      <a:noFill/>
-                      <a:ln w="6350">
-                        <a:noFill/>
-                      </a:ln>
-                    </wps:spPr>
-                    <wps:txbx>
-                      <w:txbxContent>
-                        <w:p>
-                          <w:pPr>
-                            <w:jc w:val="center"/>
-                            <w:rPr>
-                              <w:sz w:val="28"/>
-                              <w:szCs w:val="28"/>
-                            </w:rPr>
-                          </w:pPr>
-                          <w:r>
-                            <w:rPr>
-                              <w:rFonts w:ascii="Tahoma" w:hAnsi="Tahoma" w:cs="Tahoma"/>
-                              <w:b/>
-                              <w:sz w:val="28"/>
-                              <w:szCs w:val="28"/>
-                              <w14:shadow w14:blurRad="50800" w14:dist="38100" w14:dir="2700000" w14:sx="100000" w14:sy="100000" w14:kx="0" w14:ky="0" w14:algn="tl">
-                                <w14:srgbClr w14:val="000000">
-                                  <w14:alpha w14:val="60000"/>
-                                </w14:srgbClr>
-                              </w14:shadow>
-                            </w:rPr>
-                            <w:t xml:space="preserve">SECRETARIA MUNICIPAL DE EDUCAÇÃO </w:t>
-                          </w:r>
-                          <w:r>
-                            <w:rPr>
-                              <w:rFonts w:ascii="Tahoma" w:hAnsi="Tahoma" w:cs="Tahoma"/>
-                              <w:b/>
-                              <w:sz w:val="28"/>
-                              <w:szCs w:val="28"/>
-                              <w14:shadow w14:blurRad="50800" w14:dist="38100" w14:dir="2700000" w14:sx="100000" w14:sy="100000" w14:kx="0" w14:ky="0" w14:algn="tl">
-                                <w14:srgbClr w14:val="000000">
-                                  <w14:alpha w14:val="60000"/>
-                                </w14:srgbClr>
-                              </w14:shadow>
-                            </w:rPr>
-                            <w:t xml:space="preserve">E ESPORTES </w:t>
-                          </w:r>
-                          <w:r>
-                            <w:rPr>
-                              <w:rFonts w:ascii="Tahoma" w:hAnsi="Tahoma" w:cs="Tahoma"/>
-                              <w:b/>
-                              <w:sz w:val="28"/>
-                              <w:szCs w:val="28"/>
-                              <w14:shadow w14:blurRad="50800" w14:dist="38100" w14:dir="2700000" w14:sx="100000" w14:sy="100000" w14:kx="0" w14:ky="0" w14:algn="tl">
-                                <w14:srgbClr w14:val="000000">
-                                  <w14:alpha w14:val="60000"/>
-                                </w14:srgbClr>
-                              </w14:shadow>
-                            </w:rPr>
-                            <w:t>DE CARPINA</w:t>
-                          </w:r>
-                        </w:p>
-                      </w:txbxContent>
-                    </wps:txbx>
-                    <wps:bodyPr rot="0" spcFirstLastPara="0" vertOverflow="overflow" horzOverflow="overflow" vert="horz" wrap="square" lIns="91440" tIns="45720" rIns="91440" bIns="45720" numCol="1" spcCol="0" rtlCol="0" fromWordArt="0" anchor="t" anchorCtr="0" forceAA="0" compatLnSpc="1">
-                      <a:prstTxWarp prst="textNoShape">
-                        <a:avLst/>
-                      </a:prstTxWarp>
-                      <a:noAutofit/>
-                    </wps:bodyPr>
-                  </wps:wsp>
-                </a:graphicData>
-              </a:graphic>
-              <wp14:sizeRelH relativeFrom="margin">
-                <wp14:pctWidth>0</wp14:pctWidth>
-              </wp14:sizeRelH>
-              <wp14:sizeRelV relativeFrom="margin">
-                <wp14:pctHeight>0</wp14:pctHeight>
-              </wp14:sizeRelV>
-            </wp:anchor>
-          </w:drawing>
-        </mc:Choice>
-        <mc:Fallback>
-          <w:pict>
-            <v:shapetype w14:anchorId="055424B0" id="_x0000_t202" coordsize="21600,21600" o:spt="202" path="m,l,21600r21600,l21600,xe">
-              <v:stroke joinstyle="miter"/>
-              <v:path gradientshapeok="t" o:connecttype="rect"/>
-            </v:shapetype>
-            <v:shape id="Caixa de Texto 7" o:spid="_x0000_s1026" type="#_x0000_t202" style="position:absolute;margin-left:199.55pt;margin-top:-11.6pt;width:512.2pt;height:46.5pt;z-index:251671552;visibility:visible;mso-wrap-style:square;mso-width-percent:0;mso-height-percent:0;mso-wrap-distance-left:9pt;mso-wrap-distance-top:0;mso-wrap-distance-right:9pt;mso-wrap-distance-bottom:0;mso-position-horizontal:absolute;mso-position-horizontal-relative:text;mso-position-vertical:absolute;mso-position-vertical-relative:text;mso-width-percent:0;mso-height-percent:0;mso-width-relative:margin;mso-height-relative:margin;v-text-anchor:top" o:gfxdata="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" filled="f" stroked="f" strokeweight=".5pt">
-              <v:textbox>
-                <w:txbxContent>
-                  <w:p>
-                    <w:pPr>
-                      <w:jc w:val="center"/>
-                      <w:rPr>
-                        <w:sz w:val="28"/>
-                        <w:szCs w:val="28"/>
-                      </w:rPr>
-                    </w:pPr>
-                    <w:r>
-                      <w:rPr>
-                        <w:rFonts w:ascii="Tahoma" w:hAnsi="Tahoma" w:cs="Tahoma"/>
-                        <w:b/>
-                        <w:sz w:val="28"/>
-                        <w:szCs w:val="28"/>
-                        <w14:shadow w14:blurRad="50800" w14:dist="38100" w14:dir="2700000" w14:sx="100000" w14:sy="100000" w14:kx="0" w14:ky="0" w14:algn="tl">
-                          <w14:srgbClr w14:val="000000">
-                            <w14:alpha w14:val="60000"/>
-                          </w14:srgbClr>
-                        </w14:shadow>
-                      </w:rPr>
-                      <w:t xml:space="preserve">SECRETARIA MUNICIPAL DE EDUCAÇÃO </w:t>
-                    </w:r>
-                    <w:r>
-                      <w:rPr>
-                        <w:rFonts w:ascii="Tahoma" w:hAnsi="Tahoma" w:cs="Tahoma"/>
-                        <w:b/>
-                        <w:sz w:val="28"/>
-                        <w:szCs w:val="28"/>
-                        <w14:shadow w14:blurRad="50800" w14:dist="38100" w14:dir="2700000" w14:sx="100000" w14:sy="100000" w14:kx="0" w14:ky="0" w14:algn="tl">
-                          <w14:srgbClr w14:val="000000">
-                            <w14:alpha w14:val="60000"/>
-                          </w14:srgbClr>
-                        </w14:shadow>
-                      </w:rPr>
-                      <w:t xml:space="preserve">E ESPORTES </w:t>
-                    </w:r>
-                    <w:r>
-                      <w:rPr>
-                        <w:rFonts w:ascii="Tahoma" w:hAnsi="Tahoma" w:cs="Tahoma"/>
-                        <w:b/>
-                        <w:sz w:val="28"/>
-                        <w:szCs w:val="28"/>
-                        <w14:shadow w14:blurRad="50800" w14:dist="38100" w14:dir="2700000" w14:sx="100000" w14:sy="100000" w14:kx="0" w14:ky="0" w14:algn="tl">
-                          <w14:srgbClr w14:val="000000">
-                            <w14:alpha w14:val="60000"/>
-                          </w14:srgbClr>
-                        </w14:shadow>
-                      </w:rPr>
-                      <w:t>DE CARPINA</w:t>
-                    </w:r>
-                  </w:p>
-                </w:txbxContent>
-              </v:textbox>
-            </v:shape>
-          </w:pict>
-        </mc:Fallback>
-      </mc:AlternateContent>
-    </w:r>
-    <w:r>
-      <w:rPr>
-        <w:noProof/>
+        <w:sz w:val="18"/>
+        <w:szCs w:val="18"/>
       </w:rPr>
       <w:drawing>
-        <wp:anchor distT="0" distB="0" distL="114300" distR="114300" simplePos="0" relativeHeight="251658240" behindDoc="1" locked="0" layoutInCell="1" allowOverlap="1" wp14:anchorId="0B8B271C" wp14:editId="5D0B3D47">
+        <wp:anchor distT="0" distB="0" distL="114300" distR="114300" simplePos="0" relativeHeight="251658240" behindDoc="1" locked="0" layoutInCell="1" allowOverlap="1" wp14:anchorId="4AA35340" wp14:editId="6603E4B0">
           <wp:simplePos x="0" y="0"/>
-          <wp:positionH relativeFrom="column">
-            <wp:posOffset>-132715</wp:posOffset>
+          <wp:positionH relativeFrom="page">
+            <wp:align>right</wp:align>
           </wp:positionH>
           <wp:positionV relativeFrom="paragraph">
-            <wp:posOffset>-266700</wp:posOffset>
+            <wp:posOffset>-540385</wp:posOffset>
           </wp:positionV>
-          <wp:extent cx="2446020" cy="653415"/>
+          <wp:extent cx="10670878" cy="7543800"/>
           <wp:effectExtent l="0" t="0" r="0" b="0"/>
           <wp:wrapNone/>
-          <wp:docPr id="2863955" name="Imagem 4"/>
+          <wp:docPr id="281401785" name="Imagem 2"/>
           <wp:cNvGraphicFramePr>
             <a:graphicFrameLocks xmlns:a="http://schemas.openxmlformats.org/drawingml/2006/main" noChangeAspect="1"/>
           </wp:cNvGraphicFramePr>
@@ -595,10 +239,8 @@
             <a:graphicData uri="http://schemas.openxmlformats.org/drawingml/2006/picture">
               <pic:pic xmlns:pic="http://schemas.openxmlformats.org/drawingml/2006/picture">
                 <pic:nvPicPr>
-                  <pic:cNvPr id="0" name="Picture 4"/>
-                  <pic:cNvPicPr>
-                    <a:picLocks noChangeAspect="1" noChangeArrowheads="1"/>
-                  </pic:cNvPicPr>
+                  <pic:cNvPr id="281401785" name="Imagem 281401785"/>
+                  <pic:cNvPicPr/>
                 </pic:nvPicPr>
                 <pic:blipFill>
                   <a:blip r:embed="rId1">
@@ -608,92 +250,26 @@
                       </a:ext>
                     </a:extLst>
                   </a:blip>
-                  <a:srcRect/>
                   <a:stretch>
                     <a:fillRect/>
                   </a:stretch>
                 </pic:blipFill>
-                <pic:spPr bwMode="auto">
+                <pic:spPr>
                   <a:xfrm>
                     <a:off x="0" y="0"/>
-                    <a:ext cx="2446020" cy="653415"/>
+                    <a:ext cx="10670878" cy="7543800"/>
                   </a:xfrm>
                   <a:prstGeom prst="rect">
                     <a:avLst/>
                   </a:prstGeom>
-                  <a:noFill/>
-                  <a:ln>
-                    <a:noFill/>
-                  </a:ln>
                 </pic:spPr>
               </pic:pic>
             </a:graphicData>
           </a:graphic>
-        </wp:anchor>
-      </w:drawing>
-    </w:r>
-    <w:r>
-      <w:rPr>
-        <w:noProof/>
-      </w:rPr>
-      <w:drawing>
-        <wp:anchor distT="0" distB="0" distL="114300" distR="114300" simplePos="0" relativeHeight="251660288" behindDoc="1" locked="0" layoutInCell="1" allowOverlap="1" wp14:anchorId="6CD37827" wp14:editId="44642811">
-          <wp:simplePos x="0" y="0"/>
-          <wp:positionH relativeFrom="margin">
-            <wp:align>right</wp:align>
-          </wp:positionH>
-          <wp:positionV relativeFrom="paragraph">
-            <wp:posOffset>-404495</wp:posOffset>
-          </wp:positionV>
-          <wp:extent cx="724328" cy="706413"/>
-          <wp:effectExtent l="0" t="0" r="0" b="0"/>
-          <wp:wrapNone/>
-          <wp:docPr id="1634934410" name="Imagem 5"/>
-          <wp:cNvGraphicFramePr>
-            <a:graphicFrameLocks xmlns:a="http://schemas.openxmlformats.org/drawingml/2006/main" noChangeAspect="1"/>
-          </wp:cNvGraphicFramePr>
-          <a:graphic xmlns:a="http://schemas.openxmlformats.org/drawingml/2006/main">
-            <a:graphicData uri="http://schemas.openxmlformats.org/drawingml/2006/picture">
-              <pic:pic xmlns:pic="http://schemas.openxmlformats.org/drawingml/2006/picture">
-                <pic:nvPicPr>
-                  <pic:cNvPr id="0" name="Picture 5"/>
-                  <pic:cNvPicPr>
-                    <a:picLocks noChangeAspect="1" noChangeArrowheads="1"/>
-                  </pic:cNvPicPr>
-                </pic:nvPicPr>
-                <pic:blipFill>
-                  <a:blip r:embed="rId2">
-                    <a:extLst>
-                      <a:ext uri="{28A0092B-C50C-407E-A947-70E740481C1C}">
-                        <a14:useLocalDpi xmlns:a14="http://schemas.microsoft.com/office/drawing/2010/main" val="0"/>
-                      </a:ext>
-                    </a:extLst>
-                  </a:blip>
-                  <a:srcRect/>
-                  <a:stretch>
-                    <a:fillRect/>
-                  </a:stretch>
-                </pic:blipFill>
-                <pic:spPr bwMode="auto">
-                  <a:xfrm>
-                    <a:off x="0" y="0"/>
-                    <a:ext cx="724328" cy="706413"/>
-                  </a:xfrm>
-                  <a:prstGeom prst="rect">
-                    <a:avLst/>
-                  </a:prstGeom>
-                  <a:noFill/>
-                  <a:ln>
-                    <a:noFill/>
-                  </a:ln>
-                </pic:spPr>
-              </pic:pic>
-            </a:graphicData>
-          </a:graphic>
-          <wp14:sizeRelH relativeFrom="margin">
+          <wp14:sizeRelH relativeFrom="page">
             <wp14:pctWidth>0</wp14:pctWidth>
           </wp14:sizeRelH>
-          <wp14:sizeRelV relativeFrom="margin">
+          <wp14:sizeRelV relativeFrom="page">
             <wp14:pctHeight>0</wp14:pctHeight>
           </wp14:sizeRelV>
         </wp:anchor>
@@ -728,73 +304,6 @@
         <w:szCs w:val="24"/>
       </w:rPr>
     </w:pPr>
-    <w:r>
-      <w:rPr>
-        <w:noProof/>
-      </w:rPr>
-      <w:drawing>
-        <wp:anchor distT="0" distB="0" distL="114300" distR="114300" simplePos="0" relativeHeight="251669504" behindDoc="1" locked="0" layoutInCell="1" allowOverlap="1" wp14:anchorId="37472810" wp14:editId="1CF30150">
-          <wp:simplePos x="0" y="0"/>
-          <wp:positionH relativeFrom="column">
-            <wp:posOffset>1042889</wp:posOffset>
-          </wp:positionH>
-          <wp:positionV relativeFrom="paragraph">
-            <wp:posOffset>808355</wp:posOffset>
-          </wp:positionV>
-          <wp:extent cx="7339289" cy="4720130"/>
-          <wp:effectExtent l="0" t="0" r="0" b="4445"/>
-          <wp:wrapNone/>
-          <wp:docPr id="871653639" name="Imagem 6"/>
-          <wp:cNvGraphicFramePr>
-            <a:graphicFrameLocks xmlns:a="http://schemas.openxmlformats.org/drawingml/2006/main" noChangeAspect="1"/>
-          </wp:cNvGraphicFramePr>
-          <a:graphic xmlns:a="http://schemas.openxmlformats.org/drawingml/2006/main">
-            <a:graphicData uri="http://schemas.openxmlformats.org/drawingml/2006/picture">
-              <pic:pic xmlns:pic="http://schemas.openxmlformats.org/drawingml/2006/picture">
-                <pic:nvPicPr>
-                  <pic:cNvPr id="0" name="Picture 6"/>
-                  <pic:cNvPicPr>
-                    <a:picLocks noChangeAspect="1" noChangeArrowheads="1"/>
-                  </pic:cNvPicPr>
-                </pic:nvPicPr>
-                <pic:blipFill>
-                  <a:blip r:embed="rId3">
-                    <a:extLst>
-                      <a:ext uri="{28A0092B-C50C-407E-A947-70E740481C1C}">
-                        <a14:useLocalDpi xmlns:a14="http://schemas.microsoft.com/office/drawing/2010/main" val="0"/>
-                      </a:ext>
-                    </a:extLst>
-                  </a:blip>
-                  <a:srcRect/>
-                  <a:stretch>
-                    <a:fillRect/>
-                  </a:stretch>
-                </pic:blipFill>
-                <pic:spPr bwMode="auto">
-                  <a:xfrm>
-                    <a:off x="0" y="0"/>
-                    <a:ext cx="7339289" cy="4720130"/>
-                  </a:xfrm>
-                  <a:prstGeom prst="rect">
-                    <a:avLst/>
-                  </a:prstGeom>
-                  <a:noFill/>
-                  <a:ln>
-                    <a:noFill/>
-                  </a:ln>
-                </pic:spPr>
-              </pic:pic>
-            </a:graphicData>
-          </a:graphic>
-          <wp14:sizeRelH relativeFrom="margin">
-            <wp14:pctWidth>0</wp14:pctWidth>
-          </wp14:sizeRelH>
-          <wp14:sizeRelV relativeFrom="margin">
-            <wp14:pctHeight>0</wp14:pctHeight>
-          </wp14:sizeRelV>
-        </wp:anchor>
-      </w:drawing>
-    </w:r>
   </w:p>
 </w:hdr>
 </file>

</xml_diff>